<commit_message>
Clarify exact pipeline follow-up
</commit_message>
<xml_diff>
--- a/docs/Bloom_Filter_Report_Optimized.docx
+++ b/docs/Bloom_Filter_Report_Optimized.docx
@@ -2659,9 +2659,6 @@
           <w:ilvl w:val="1"/>
           <w:numId w:val="0"/>
         </w:numPr>
-        <w:rPr>
-          <w:rFonts w:hint="eastAsia"/>
-        </w:rPr>
       </w:pPr>
       <w:bookmarkStart w:id="6" w:name="study_5"/>
       <w:r>
@@ -2758,7 +2755,6 @@
             <w:pPr>
               <w:spacing w:after="100" w:line="240" w:lineRule="auto"/>
               <w:rPr>
-                <w:rFonts w:hint="eastAsia"/>
                 <w:b/>
                 <w:color w:val="FFFFFF"/>
                 <w:sz w:val="20"/>
@@ -3210,17 +3206,21 @@
     </w:p>
     <w:p>
       <w:pPr>
-        <w:pStyle w:val="Normal"/>
         <w:numPr>
           <w:ilvl w:val="1"/>
           <w:numId w:val="0"/>
         </w:numPr>
-      </w:pPr>
-      <w:r>
-        <w:t>Storage comparison:</w:t>
         <w:rPr>
           <w:b/>
+          <w:bCs/>
         </w:rPr>
+      </w:pPr>
+      <w:r>
+        <w:rPr>
+          <w:b/>
+          <w:bCs/>
+        </w:rPr>
+        <w:t>Storage comparison:</w:t>
       </w:r>
     </w:p>
     <w:tbl>
@@ -4099,9 +4099,9 @@
           <w:noProof/>
         </w:rPr>
         <w:drawing>
-          <wp:inline distT="0" distB="0" distL="0" distR="0" wp14:anchorId="74F86E7B" wp14:editId="79B35F7D">
-            <wp:extent cx="5350000" cy="1819000"/>
-            <wp:effectExtent l="0" t="0" r="0" b="0"/>
+          <wp:inline distT="0" distB="0" distL="0" distR="0" wp14:anchorId="74F86E7B" wp14:editId="782E7F5A">
+            <wp:extent cx="4323169" cy="1469877"/>
+            <wp:effectExtent l="0" t="0" r="0" b="3810"/>
             <wp:docPr id="105" name="Study figure 5"/>
             <wp:cNvGraphicFramePr/>
             <a:graphic xmlns:a="http://schemas.openxmlformats.org/drawingml/2006/main">
@@ -4120,7 +4120,7 @@
                   <pic:spPr>
                     <a:xfrm>
                       <a:off x="0" y="0"/>
-                      <a:ext cx="5350000" cy="1819000"/>
+                      <a:ext cx="4323169" cy="1469877"/>
                     </a:xfrm>
                     <a:prstGeom prst="rect">
                       <a:avLst/>
@@ -4146,352 +4146,9 @@
     </w:p>
     <w:p>
       <w:r>
-        <w:t>The final timing check uses contains and contains_full_scan on the same Bloom object and exact set. Both answers are verified per key. It tests two set sizes, k = 1 or 7, four query mixes and four seeds, with seven repetitions of 200,000 queries. The timing and analysis procedure follows Section 2.2, giving 1,344 rows.</w:t>
-      </w:r>
-    </w:p>
-    <w:tbl>
-      <w:tblPr>
-        <w:tblW w:w="8500" w:type="dxa"/>
-        <w:tblBorders>
-          <w:top w:val="single" w:sz="4" w:space="0" w:color="D9D9D9"/>
-          <w:left w:val="single" w:sz="4" w:space="0" w:color="D9D9D9"/>
-          <w:bottom w:val="single" w:sz="4" w:space="0" w:color="D9D9D9"/>
-          <w:right w:val="single" w:sz="4" w:space="0" w:color="D9D9D9"/>
-          <w:insideH w:val="single" w:sz="4" w:space="0" w:color="D9D9D9"/>
-          <w:insideV w:val="single" w:sz="4" w:space="0" w:color="D9D9D9"/>
-        </w:tblBorders>
-        <w:tblLook w:val="04A0" w:firstRow="1" w:lastRow="0" w:firstColumn="1" w:lastColumn="0" w:noHBand="0" w:noVBand="1"/>
-      </w:tblPr>
-      <w:tblGrid>
-        <w:gridCol w:w="2834"/>
-        <w:gridCol w:w="2833"/>
-        <w:gridCol w:w="2833"/>
-      </w:tblGrid>
-      <w:tr>
-        <w:trPr>
-          <w:cantSplit/>
-          <w:tblHeader/>
-        </w:trPr>
-        <w:tc>
-          <w:tcPr>
-            <w:tcW w:w="2833" w:type="dxa"/>
-            <w:shd w:val="clear" w:color="auto" w:fill="1F497D"/>
-            <w:tcMar>
-              <w:top w:w="90" w:type="dxa"/>
-              <w:left w:w="90" w:type="dxa"/>
-              <w:bottom w:w="90" w:type="dxa"/>
-              <w:right w:w="90" w:type="dxa"/>
-            </w:tcMar>
-            <w:vAlign w:val="center"/>
-          </w:tcPr>
-          <w:p>
-            <w:pPr>
-              <w:spacing w:after="100" w:line="240" w:lineRule="auto"/>
-            </w:pPr>
-            <w:r>
-              <w:rPr>
-                <w:b/>
-                <w:color w:val="FFFFFF"/>
-                <w:sz w:val="20"/>
-              </w:rPr>
-              <w:t>n = 200,000; k = 7</w:t>
-            </w:r>
-          </w:p>
-        </w:tc>
-        <w:tc>
-          <w:tcPr>
-            <w:tcW w:w="2833" w:type="dxa"/>
-            <w:shd w:val="clear" w:color="auto" w:fill="1F497D"/>
-            <w:tcMar>
-              <w:top w:w="90" w:type="dxa"/>
-              <w:left w:w="90" w:type="dxa"/>
-              <w:bottom w:w="90" w:type="dxa"/>
-              <w:right w:w="90" w:type="dxa"/>
-            </w:tcMar>
-            <w:vAlign w:val="center"/>
-          </w:tcPr>
-          <w:p>
-            <w:pPr>
-              <w:spacing w:after="100" w:line="240" w:lineRule="auto"/>
-            </w:pPr>
-            <w:r>
-              <w:rPr>
-                <w:b/>
-                <w:color w:val="FFFFFF"/>
-                <w:sz w:val="20"/>
-              </w:rPr>
-              <w:t>Set / early time</w:t>
-            </w:r>
-          </w:p>
-        </w:tc>
-        <w:tc>
-          <w:tcPr>
-            <w:tcW w:w="2833" w:type="dxa"/>
-            <w:shd w:val="clear" w:color="auto" w:fill="1F497D"/>
-            <w:tcMar>
-              <w:top w:w="90" w:type="dxa"/>
-              <w:left w:w="90" w:type="dxa"/>
-              <w:bottom w:w="90" w:type="dxa"/>
-              <w:right w:w="90" w:type="dxa"/>
-            </w:tcMar>
-            <w:vAlign w:val="center"/>
-          </w:tcPr>
-          <w:p>
-            <w:pPr>
-              <w:spacing w:after="100" w:line="240" w:lineRule="auto"/>
-            </w:pPr>
-            <w:r>
-              <w:rPr>
-                <w:b/>
-                <w:color w:val="FFFFFF"/>
-                <w:sz w:val="20"/>
-              </w:rPr>
-              <w:t>Set / full time</w:t>
-            </w:r>
-          </w:p>
-        </w:tc>
-      </w:tr>
-      <w:tr>
-        <w:trPr>
-          <w:cantSplit/>
-        </w:trPr>
-        <w:tc>
-          <w:tcPr>
-            <w:tcW w:w="2833" w:type="dxa"/>
-            <w:shd w:val="clear" w:color="auto" w:fill="F1F4F7"/>
-            <w:tcMar>
-              <w:top w:w="90" w:type="dxa"/>
-              <w:left w:w="90" w:type="dxa"/>
-              <w:bottom w:w="90" w:type="dxa"/>
-              <w:right w:w="90" w:type="dxa"/>
-            </w:tcMar>
-            <w:vAlign w:val="center"/>
-          </w:tcPr>
-          <w:p>
-            <w:pPr>
-              <w:spacing w:after="100" w:line="240" w:lineRule="auto"/>
-            </w:pPr>
-            <w:r>
-              <w:rPr>
-                <w:color w:val="000000"/>
-                <w:sz w:val="20"/>
-              </w:rPr>
-              <w:t>50% absent</w:t>
-            </w:r>
-          </w:p>
-        </w:tc>
-        <w:tc>
-          <w:tcPr>
-            <w:tcW w:w="2833" w:type="dxa"/>
-            <w:shd w:val="clear" w:color="auto" w:fill="F1F4F7"/>
-            <w:tcMar>
-              <w:top w:w="90" w:type="dxa"/>
-              <w:left w:w="90" w:type="dxa"/>
-              <w:bottom w:w="90" w:type="dxa"/>
-              <w:right w:w="90" w:type="dxa"/>
-            </w:tcMar>
-            <w:vAlign w:val="center"/>
-          </w:tcPr>
-          <w:p>
-            <w:pPr>
-              <w:spacing w:after="100" w:line="240" w:lineRule="auto"/>
-            </w:pPr>
-            <w:r>
-              <w:rPr>
-                <w:color w:val="000000"/>
-                <w:sz w:val="20"/>
-              </w:rPr>
-              <w:t>0.732 ± 0.006</w:t>
-            </w:r>
-          </w:p>
-        </w:tc>
-        <w:tc>
-          <w:tcPr>
-            <w:tcW w:w="2833" w:type="dxa"/>
-            <w:shd w:val="clear" w:color="auto" w:fill="F1F4F7"/>
-            <w:tcMar>
-              <w:top w:w="90" w:type="dxa"/>
-              <w:left w:w="90" w:type="dxa"/>
-              <w:bottom w:w="90" w:type="dxa"/>
-              <w:right w:w="90" w:type="dxa"/>
-            </w:tcMar>
-            <w:vAlign w:val="center"/>
-          </w:tcPr>
-          <w:p>
-            <w:pPr>
-              <w:spacing w:after="100" w:line="240" w:lineRule="auto"/>
-            </w:pPr>
-            <w:r>
-              <w:rPr>
-                <w:color w:val="000000"/>
-                <w:sz w:val="20"/>
-              </w:rPr>
-              <w:t>0.629 ± 0.004</w:t>
-            </w:r>
-          </w:p>
-        </w:tc>
-      </w:tr>
-      <w:tr>
-        <w:trPr>
-          <w:cantSplit/>
-        </w:trPr>
-        <w:tc>
-          <w:tcPr>
-            <w:tcW w:w="2833" w:type="dxa"/>
-            <w:shd w:val="clear" w:color="auto" w:fill="FFFFFF"/>
-            <w:tcMar>
-              <w:top w:w="90" w:type="dxa"/>
-              <w:left w:w="90" w:type="dxa"/>
-              <w:bottom w:w="90" w:type="dxa"/>
-              <w:right w:w="90" w:type="dxa"/>
-            </w:tcMar>
-            <w:vAlign w:val="center"/>
-          </w:tcPr>
-          <w:p>
-            <w:pPr>
-              <w:spacing w:after="100" w:line="240" w:lineRule="auto"/>
-            </w:pPr>
-            <w:r>
-              <w:rPr>
-                <w:color w:val="000000"/>
-                <w:sz w:val="20"/>
-              </w:rPr>
-              <w:t>90% absent</w:t>
-            </w:r>
-          </w:p>
-        </w:tc>
-        <w:tc>
-          <w:tcPr>
-            <w:tcW w:w="2833" w:type="dxa"/>
-            <w:shd w:val="clear" w:color="auto" w:fill="FFFFFF"/>
-            <w:tcMar>
-              <w:top w:w="90" w:type="dxa"/>
-              <w:left w:w="90" w:type="dxa"/>
-              <w:bottom w:w="90" w:type="dxa"/>
-              <w:right w:w="90" w:type="dxa"/>
-            </w:tcMar>
-            <w:vAlign w:val="center"/>
-          </w:tcPr>
-          <w:p>
-            <w:pPr>
-              <w:spacing w:after="100" w:line="240" w:lineRule="auto"/>
-            </w:pPr>
-            <w:r>
-              <w:rPr>
-                <w:color w:val="000000"/>
-                <w:sz w:val="20"/>
-              </w:rPr>
-              <w:t>0.676 ± 0.016</w:t>
-            </w:r>
-          </w:p>
-        </w:tc>
-        <w:tc>
-          <w:tcPr>
-            <w:tcW w:w="2833" w:type="dxa"/>
-            <w:shd w:val="clear" w:color="auto" w:fill="FFFFFF"/>
-            <w:tcMar>
-              <w:top w:w="90" w:type="dxa"/>
-              <w:left w:w="90" w:type="dxa"/>
-              <w:bottom w:w="90" w:type="dxa"/>
-              <w:right w:w="90" w:type="dxa"/>
-            </w:tcMar>
-            <w:vAlign w:val="center"/>
-          </w:tcPr>
-          <w:p>
-            <w:pPr>
-              <w:spacing w:after="100" w:line="240" w:lineRule="auto"/>
-            </w:pPr>
-            <w:r>
-              <w:rPr>
-                <w:color w:val="000000"/>
-                <w:sz w:val="20"/>
-              </w:rPr>
-              <w:t>1.011 ± 0.028</w:t>
-            </w:r>
-          </w:p>
-        </w:tc>
-      </w:tr>
-      <w:tr>
-        <w:trPr>
-          <w:cantSplit/>
-        </w:trPr>
-        <w:tc>
-          <w:tcPr>
-            <w:tcW w:w="2833" w:type="dxa"/>
-            <w:shd w:val="clear" w:color="auto" w:fill="F1F4F7"/>
-            <w:tcMar>
-              <w:top w:w="90" w:type="dxa"/>
-              <w:left w:w="90" w:type="dxa"/>
-              <w:bottom w:w="90" w:type="dxa"/>
-              <w:right w:w="90" w:type="dxa"/>
-            </w:tcMar>
-            <w:vAlign w:val="center"/>
-          </w:tcPr>
-          <w:p>
-            <w:pPr>
-              <w:spacing w:after="100" w:line="240" w:lineRule="auto"/>
-            </w:pPr>
-            <w:r>
-              <w:rPr>
-                <w:color w:val="000000"/>
-                <w:sz w:val="20"/>
-              </w:rPr>
-              <w:t>100% absent</w:t>
-            </w:r>
-          </w:p>
-        </w:tc>
-        <w:tc>
-          <w:tcPr>
-            <w:tcW w:w="2833" w:type="dxa"/>
-            <w:shd w:val="clear" w:color="auto" w:fill="F1F4F7"/>
-            <w:tcMar>
-              <w:top w:w="90" w:type="dxa"/>
-              <w:left w:w="90" w:type="dxa"/>
-              <w:bottom w:w="90" w:type="dxa"/>
-              <w:right w:w="90" w:type="dxa"/>
-            </w:tcMar>
-            <w:vAlign w:val="center"/>
-          </w:tcPr>
-          <w:p>
-            <w:pPr>
-              <w:spacing w:after="100" w:line="240" w:lineRule="auto"/>
-            </w:pPr>
-            <w:r>
-              <w:rPr>
-                <w:color w:val="000000"/>
-                <w:sz w:val="20"/>
-              </w:rPr>
-              <w:t>0.707 ± 0.041</w:t>
-            </w:r>
-          </w:p>
-        </w:tc>
-        <w:tc>
-          <w:tcPr>
-            <w:tcW w:w="2833" w:type="dxa"/>
-            <w:shd w:val="clear" w:color="auto" w:fill="F1F4F7"/>
-            <w:tcMar>
-              <w:top w:w="90" w:type="dxa"/>
-              <w:left w:w="90" w:type="dxa"/>
-              <w:bottom w:w="90" w:type="dxa"/>
-              <w:right w:w="90" w:type="dxa"/>
-            </w:tcMar>
-            <w:vAlign w:val="center"/>
-          </w:tcPr>
-          <w:p>
-            <w:pPr>
-              <w:spacing w:after="100" w:line="240" w:lineRule="auto"/>
-            </w:pPr>
-            <w:r>
-              <w:rPr>
-                <w:color w:val="000000"/>
-                <w:sz w:val="20"/>
-              </w:rPr>
-              <w:t>1.282 ± 0.098</w:t>
-            </w:r>
-          </w:p>
-        </w:tc>
-      </w:tr>
-    </w:tbl>
+        <w:t>This section compares two complete exact-query pipelines. In both pipelines, the Bloom filter first rejects keys that are definitely absent, and the exact set checks every possible match so the final answer remains exact. The difference is only in the Bloom query: contains stops at the first zero bit, while contains_full_scan checks all k positions before returning. The final timing check uses the same Bloom object and exact set for both versions. It tests two set sizes, k = 1 or 7, four query mixes and four seeds, with seven repetitions of 200,000 queries. The timing and analysis procedure follows Section 2.2, giving 1,344 rows.</w:t>
+      </w:r>
+    </w:p>
     <w:p>
       <w:pPr>
         <w:spacing w:before="140"/>
@@ -4502,11 +4159,7 @@
     </w:p>
     <w:p>
       <w:r>
-        <w:t xml:space="preserve">One hash still gives the fastest tested all-absent lookup: its speedup at 200,000 keys is 2.726 ± 0.055. Thus, improving the seven-hash code does not change the answer to the follow-up question: lowest error does not imply fastest lookup. The one-hash control shows much smaller differences between query versions, </w:t>
-      </w:r>
-      <w:r>
-        <w:lastRenderedPageBreak/>
-        <w:t>but these measurements do not identify a hardware cause. Configuration order was fixed on an active desktop.</w:t>
+        <w:t>One hash still gives the fastest tested all-absent lookup: its speedup at 200,000 keys is 2.726 ± 0.055. Thus, improving the seven-hash code does not change the answer to the follow-up question: lowest error does not imply fastest lookup. The one-hash control shows much smaller differences between query versions, but these measurements do not identify a hardware cause. Configuration order was fixed on an active desktop.</w:t>
       </w:r>
     </w:p>
     <w:p>
@@ -8647,6 +8300,7 @@
   <w:style w:type="character" w:default="1" w:styleId="DefaultParagraphFont">
     <w:name w:val="Default Paragraph Font"/>
     <w:uiPriority w:val="1"/>
+    <w:semiHidden/>
     <w:unhideWhenUsed/>
   </w:style>
   <w:style w:type="table" w:default="1" w:styleId="TableNormal">

</xml_diff>

<commit_message>
Add final PDF report and clarify AI verification scope
</commit_message>
<xml_diff>
--- a/docs/Bloom_Filter_Report_Optimized.docx
+++ b/docs/Bloom_Filter_Report_Optimized.docx
@@ -183,11 +183,11 @@
                             </w:r>
                             <w:r>
                               <w:rPr>
-                                <w:rFonts w:eastAsia="Arial" w:hint="eastAsia"/>
+                                <w:rFonts w:eastAsia="Arial"/>
                                 <w:color w:val="FFFFFF"/>
                                 <w:szCs w:val="24"/>
                               </w:rPr>
-                              <w:t>10</w:t>
+                              <w:t>22</w:t>
                             </w:r>
                             <w:r>
                               <w:rPr>
@@ -387,11 +387,11 @@
                       </w:r>
                       <w:r>
                         <w:rPr>
-                          <w:rFonts w:eastAsia="Arial" w:hint="eastAsia"/>
+                          <w:rFonts w:eastAsia="Arial"/>
                           <w:color w:val="FFFFFF"/>
                           <w:szCs w:val="24"/>
                         </w:rPr>
-                        <w:t>10</w:t>
+                        <w:t>22</w:t>
                       </w:r>
                       <w:r>
                         <w:rPr>
@@ -4898,7 +4898,7 @@
     </w:p>
     <w:p>
       <w:r>
-        <w:t>I used to think that adding a Bloom filter would usually speed up an exact lookup. That was too simple. With k = 1 and 200,000 keys, the speedup was only 0.947 when half of the queries were absent, so the filter made the lookup slightly slower. Once the absent-query proportion increased to 90%, the speedup became 1.557, and it reached 2.709 when every query was absent. The filter helped because it could reject enough missing keys before they reached the exact set. This also explains why the number of hashes matters: using more hashes can reduce false positives, but it also makes every query more expensive.</w:t>
+        <w:t>I learned to separate low error from fast exact lookup. Seven hashes gave 0.821% false positives, compared with 9.502% for one hash. However, with 200,000 keys and all queries absent, the one-hash exact pipeline was about 2.71 times as fast as the set alone. The original seven-hash early-exit version showed no clear speed advantage. Extra filtering is useful only when the lookups it avoids save enough time to pay for it.</w:t>
       </w:r>
     </w:p>
     <w:p>
@@ -4915,7 +4915,7 @@
     </w:p>
     <w:p>
       <w:r>
-        <w:t>At first, early exit seemed obviously better. It stops at the first zero bit, and in the experiment it checked about two positions per absent query instead of all seven. Surprisingly, full scanning was faster when all queries were absent. I had been treating the number of checks as if it directly represented running time. The experiment changed that view. Branches, compiler output and hardware effects can matter as much as the number of logical operations, so the complete workload still needs to be measured.</w:t>
+        <w:t>The early-exit result showed why counting operations is not enough to predict runtime. It checked about two bits on average, yet checking all seven was faster. The later exact-pipeline test also showed that full scanning helped when all queries were absent but lost to early exit when half were absent. This makes workload testing necessary; the code with fewer checks is not automatically the faster choice.</w:t>
       </w:r>
     </w:p>
     <w:p>
@@ -4932,15 +4932,15 @@
     </w:p>
     <w:p>
       <w:r>
-        <w:t xml:space="preserve">I was initially worried that putting too many keys into the filter could make an inserted key fail a query. That did not happen. Even at three times the design capacity, the filter still had no false negatives. What changed was its ability to reject absent keys: the false-positive rate rose to 40.182%. The filter was still correct, but it was no longer very effective. This taught me that the expected number of keys should be estimated before choosing the size of the filter, with room left for future growth.</w:t>
+        <w:t xml:space="preserve">I also learned that a correct filter </w:t>
       </w:r>
       <w:proofErr w:type="gramStart"/>
       <w:r>
-        <w:t/>
+        <w:t>can</w:t>
       </w:r>
       <w:proofErr w:type="gramEnd"/>
       <w:r>
-        <w:t xml:space="preserve"/>
+        <w:t xml:space="preserve"> become less useful. At three times its design capacity, it still had no false negatives, but about 40% of absent queries passed through. Correctness tests need to check that inserted keys are never rejected. Performance tests also need to check whether the error rate is acceptable at the intended capacity.</w:t>
       </w:r>
     </w:p>
     <w:p>
@@ -5007,32 +5007,247 @@
       <w:bookmarkEnd w:id="14"/>
     </w:p>
     <w:p>
-      <w:r>
-        <w:t>I used OpenAI Codex for most of the code and report, including implementation, debugging, tests, experiment design, running measurements, analysis and drafting. It also adapted the Word template and uploaded the repository. The September 22 revision used Codex to add full scanning, compare the two exact pipelines and update the recommendations.</w:t>
-      </w:r>
-    </w:p>
-    <w:p>
-      <w:r>
-        <w:t xml:space="preserve">One problem was that the first generated reference test reused </w:t>
-      </w:r>
+      <w:pPr>
+        <w:rPr>
+          <w:lang w:val="en-AU"/>
+        </w:rPr>
+      </w:pPr>
+      <w:r>
+        <w:rPr>
+          <w:b/>
+          <w:bCs/>
+          <w:lang w:val="en-AU"/>
+        </w:rPr>
+        <w:t>Tools used.</w:t>
+      </w:r>
+      <w:r>
+        <w:rPr>
+          <w:lang w:val="en-AU"/>
+        </w:rPr>
+        <w:t xml:space="preserve"> </w:t>
+      </w:r>
+    </w:p>
+    <w:p>
+      <w:pPr>
+        <w:rPr>
+          <w:rFonts w:hint="eastAsia"/>
+          <w:lang w:val="en-AU"/>
+        </w:rPr>
+      </w:pPr>
+      <w:r>
+        <w:rPr>
+          <w:lang w:val="en-AU"/>
+        </w:rPr>
+        <w:t>I used OpenAI Codex heavily throughout the project, mainly for the implementation, experiments and report preparation</w:t>
+      </w:r>
+      <w:r>
+        <w:rPr>
+          <w:rFonts w:hint="eastAsia"/>
+          <w:lang w:val="en-AU"/>
+        </w:rPr>
+        <w:t>.</w:t>
+      </w:r>
+    </w:p>
+    <w:p>
+      <w:pPr>
+        <w:rPr>
+          <w:b/>
+          <w:bCs/>
+          <w:lang w:val="en-AU"/>
+        </w:rPr>
+      </w:pPr>
+      <w:r>
+        <w:rPr>
+          <w:b/>
+          <w:bCs/>
+          <w:lang w:val="en-AU"/>
+        </w:rPr>
+        <w:t>What I used them for.</w:t>
+      </w:r>
+    </w:p>
+    <w:p>
+      <w:pPr>
+        <w:rPr>
+          <w:lang w:val="en-AU"/>
+        </w:rPr>
+      </w:pPr>
+      <w:r>
+        <w:rPr>
+          <w:lang w:val="en-AU"/>
+        </w:rPr>
+        <w:t>Codex helped scaffold the Bloom-filter implementation, debug the code, write tests, generate experiment scripts and plots, explain concepts I did not understand, draft parts of the report and format the Word document. I checked the generated work by running the tests, sanitizers and experiments.</w:t>
+      </w:r>
+    </w:p>
+    <w:p>
+      <w:pPr>
+        <w:rPr>
+          <w:lang w:val="en-AU"/>
+        </w:rPr>
+      </w:pPr>
+      <w:r>
+        <w:rPr>
+          <w:b/>
+          <w:bCs/>
+          <w:lang w:val="en-AU"/>
+        </w:rPr>
+        <w:t>Where the AI was wrong or unhelpful.</w:t>
+      </w:r>
+      <w:r>
+        <w:rPr>
+          <w:lang w:val="en-AU"/>
+        </w:rPr>
+        <w:t xml:space="preserve"> </w:t>
+      </w:r>
+    </w:p>
+    <w:p>
+      <w:pPr>
+        <w:rPr>
+          <w:lang w:val="en-AU"/>
+        </w:rPr>
+      </w:pPr>
+      <w:r>
+        <w:rPr>
+          <w:lang w:val="en-AU"/>
+        </w:rPr>
+        <w:t xml:space="preserve">One generated reference test reused </w:t>
+      </w:r>
+      <w:proofErr w:type="spellStart"/>
       <w:proofErr w:type="gramStart"/>
       <w:r>
-        <w:t>BloomFilter::</w:t>
+        <w:rPr>
+          <w:lang w:val="en-AU"/>
+        </w:rPr>
+        <w:t>BloomFilter</w:t>
+      </w:r>
+      <w:proofErr w:type="spellEnd"/>
+      <w:r>
+        <w:rPr>
+          <w:lang w:val="en-AU"/>
+        </w:rPr>
+        <w:t>::position(</w:t>
       </w:r>
       <w:proofErr w:type="gramEnd"/>
       <w:r>
-        <w:t>position. If that function was wrong, the test could repeat the same error. AI-assisted review added fixed expected mixer outputs and positions, plus checks that the exact pipeline and set agreed on each key. Commit 93063ae contains the initial version, and the test diff records the changes.</w:t>
-      </w:r>
-    </w:p>
-    <w:p>
-      <w:r>
-        <w:t>Another problem was that the generated analysis script assumed SciPy and Matplotlib were installed. It failed with ModuleNotFoundError for scipy and then matplotlib. The fix replaced the SciPy dependency with explicit t critical values for the supported seed counts and installed the plotting dependencies locally. The commands and successful output were recorded; the raw measurements stayed unchanged.</w:t>
-      </w:r>
-    </w:p>
-    <w:p>
-      <w:r>
-        <w:t>Codex ran the builds, tests, sanitizers, CSV checks and plot generation. I worked through the bit indexing, insertion invariant and query logic during code review. I relied on the published mixer constants rather than deriving them. Hash independence and the hardware cause of the timing results remain unproven. The |= to = example was deliberately written to show a failure, rather than being an accidental AI bug.</w:t>
-      </w:r>
+        <w:rPr>
+          <w:lang w:val="en-AU"/>
+        </w:rPr>
+        <w:t xml:space="preserve">) to calculate its expected positions. This meant the test could repeat the same error as the implementation. I replaced part of the test with fixed expected mixer outputs and </w:t>
+      </w:r>
+      <w:proofErr w:type="gramStart"/>
+      <w:r>
+        <w:rPr>
+          <w:lang w:val="en-AU"/>
+        </w:rPr>
+        <w:t>positions, and</w:t>
+      </w:r>
+      <w:proofErr w:type="gramEnd"/>
+      <w:r>
+        <w:rPr>
+          <w:lang w:val="en-AU"/>
+        </w:rPr>
+        <w:t xml:space="preserve"> added checks against the exact set for every tested key.</w:t>
+      </w:r>
+    </w:p>
+    <w:p>
+      <w:pPr>
+        <w:rPr>
+          <w:lang w:val="en-AU"/>
+        </w:rPr>
+      </w:pPr>
+      <w:r>
+        <w:rPr>
+          <w:lang w:val="en-AU"/>
+        </w:rPr>
+        <w:t xml:space="preserve">A generated analysis script also assumed that SciPy and Matplotlib were already installed. It failed with </w:t>
+      </w:r>
+      <w:proofErr w:type="spellStart"/>
+      <w:r>
+        <w:rPr>
+          <w:lang w:val="en-AU"/>
+        </w:rPr>
+        <w:t>ModuleNotFoundError</w:t>
+      </w:r>
+      <w:proofErr w:type="spellEnd"/>
+      <w:r>
+        <w:rPr>
+          <w:lang w:val="en-AU"/>
+        </w:rPr>
+        <w:t>. I changed the confidence-interval calculation to use the supported t critical values directly and installed the plotting dependencies before rerunning the analysis.</w:t>
+      </w:r>
+    </w:p>
+    <w:p>
+      <w:pPr>
+        <w:rPr>
+          <w:lang w:val="en-AU"/>
+        </w:rPr>
+      </w:pPr>
+      <w:r>
+        <w:rPr>
+          <w:lang w:val="en-AU"/>
+        </w:rPr>
+        <w:t xml:space="preserve">The timing explanation was also initially too simple. I expected early exit to be faster because it checked fewer bits. The first diagnostic used a separate array, so it did not fully represent the complete Bloom-plus-exact-set pipeline. I then </w:t>
+      </w:r>
+      <w:r>
+        <w:rPr>
+          <w:lang w:val="en-AU"/>
+        </w:rPr>
+        <w:t xml:space="preserve">ask ai to </w:t>
+      </w:r>
+      <w:r>
+        <w:rPr>
+          <w:lang w:val="en-AU"/>
+        </w:rPr>
+        <w:t xml:space="preserve">ran a follow-up using the same Bloom object and measured both query </w:t>
+      </w:r>
+      <w:r>
+        <w:rPr>
+          <w:lang w:val="en-AU"/>
+        </w:rPr>
+        <w:lastRenderedPageBreak/>
+        <w:t>versions through the exact set. This showed that full scanning could be faster for all-absent queries but slower for mixed queries.</w:t>
+      </w:r>
+    </w:p>
+    <w:p>
+      <w:pPr>
+        <w:rPr>
+          <w:lang w:val="en-AU"/>
+        </w:rPr>
+      </w:pPr>
+      <w:r>
+        <w:rPr>
+          <w:b/>
+          <w:bCs/>
+          <w:lang w:val="en-AU"/>
+        </w:rPr>
+        <w:t>What I understand and what I still take on trust.</w:t>
+      </w:r>
+      <w:r>
+        <w:rPr>
+          <w:lang w:val="en-AU"/>
+        </w:rPr>
+        <w:t xml:space="preserve"> </w:t>
+      </w:r>
+    </w:p>
+    <w:p>
+      <w:pPr>
+        <w:rPr>
+          <w:lang w:val="en-AU"/>
+        </w:rPr>
+      </w:pPr>
+      <w:r>
+        <w:rPr>
+          <w:lang w:val="en-AU"/>
+        </w:rPr>
+        <w:t>I understand the Bloom-filter invariant, the packed-word representation, bit indexing, the false-positive calculation, the exact-query pipeline and the main experimental results. I still take the published SplitMix64 constants and their distribution quality mostly on trust because this project did not independently compare alternative mixer constants. I also cannot identify the exact hardware or compiler reason why full scanning was faster in some workloads, because I did not collect assembly-level or hardware-counter evidence.</w:t>
+      </w:r>
+    </w:p>
+    <w:p>
+      <w:pPr>
+        <w:rPr>
+          <w:rFonts w:hint="eastAsia"/>
+          <w:lang w:val="en-AU"/>
+        </w:rPr>
+      </w:pPr>
     </w:p>
     <w:p>
       <w:pPr>
@@ -5099,8 +5314,26 @@
       </w:r>
     </w:p>
     <w:p>
-      <w:r>
-        <w:t>Repository: https://github.com/mojitote/41052-a1-bloom-filter-study. Main data: results/full-20260910/. Follow-up data: results/early-exit-20260910.csv. New exact-pipeline data: results/pipeline-exit-20260922.csv; analysis: scripts/analyze_pipeline.py. Original environment: results/environment.json; revision metadata: results/upgrade-environment-20260922.json. Exact commands and dependency setup: README.md. Numerical tables and figure source: figures/ and scripts/analyze.py. All external sources accessed on 10 September 2026.</w:t>
+      <w:pPr>
+        <w:rPr>
+          <w:rFonts w:hint="eastAsia"/>
+        </w:rPr>
+      </w:pPr>
+      <w:r>
+        <w:t xml:space="preserve">Repository: https://github.com/mojitote/41052-a1-bloom-filter-study. Main data: results/full-20260910/. Follow-up data: results/early-exit-20260910.csv. New exact-pipeline data: results/pipeline-exit-20260922.csv; analysis: scripts/analyze_pipeline.py. </w:t>
+      </w:r>
+    </w:p>
+    <w:p>
+      <w:r>
+        <w:t>Original environment: results/</w:t>
+      </w:r>
+      <w:proofErr w:type="spellStart"/>
+      <w:r>
+        <w:t>environment.json</w:t>
+      </w:r>
+      <w:proofErr w:type="spellEnd"/>
+      <w:r>
+        <w:t>; revision metadata: results/upgrade-environment-20260922.json. Exact commands and dependency setup: README.md. Numerical tables and figure source: figures/ and scripts/analyze.py. All external sources accessed on 10 September 2026.</w:t>
       </w:r>
     </w:p>
     <w:sectPr>
@@ -5222,7 +5455,25 @@
         <w:szCs w:val="16"/>
         <w:lang w:val="en-US"/>
       </w:rPr>
-      <w:t xml:space="preserve">ate: 10 September 2026 </w:t>
+      <w:t xml:space="preserve">ate: </w:t>
+    </w:r>
+    <w:r>
+      <w:rPr>
+        <w:color w:val="0F4BEB"/>
+        <w:sz w:val="16"/>
+        <w:szCs w:val="16"/>
+        <w:lang w:val="en-US"/>
+      </w:rPr>
+      <w:t>22</w:t>
+    </w:r>
+    <w:r>
+      <w:rPr>
+        <w:color w:val="0F4BEB"/>
+        <w:sz w:val="16"/>
+        <w:szCs w:val="16"/>
+        <w:lang w:val="en-US"/>
+      </w:rPr>
+      <w:t xml:space="preserve"> September 2026 </w:t>
     </w:r>
   </w:p>
   <w:p>
@@ -8300,7 +8551,6 @@
   <w:style w:type="character" w:default="1" w:styleId="DefaultParagraphFont">
     <w:name w:val="Default Paragraph Font"/>
     <w:uiPriority w:val="1"/>
-    <w:semiHidden/>
     <w:unhideWhenUsed/>
   </w:style>
   <w:style w:type="table" w:default="1" w:styleId="TableNormal">

</xml_diff>